<commit_message>
vps correction and image corrections
</commit_message>
<xml_diff>
--- a/templates/reena-all-template.docx
+++ b/templates/reena-all-template.docx
@@ -810,7 +810,7 @@
         <w:jc w:val="center"/>
       </w:pPr>
       <w:r>
-        <w:t xml:space="preserve">{%photo}</w:t>
+        <w:t xml:space="preserve">{%observationPhotoKey}</w:t>
       </w:r>
     </w:p>
     <w:p>
@@ -827,7 +827,7 @@
           <w:sz w:val="28"/>
           <w:szCs w:val="28"/>
         </w:rPr>
-        <w:t xml:space="preserve">{photoFallback}</w:t>
+        <w:t xml:space="preserve">{photoText}</w:t>
       </w:r>
     </w:p>
     <w:p>

</xml_diff>